<commit_message>
docs(paper): 13 figures intégrées (10 existantes + 3 paper-spécifiques)
Figures paper-spécifiques nouvellement créées (build_paper_figures.py) :
  - Fig 1 architecture en 3 piliers (boîtes + flèches vers APS+MES)
  - Fig 2 radar synthèse exécutive 5 dimensions × 4 doctrines
  - Fig 3 mapping 5 domaines de perturbation → 5 hazards simulateur

Figures existantes intégrées au paper aux sections appropriées :
  §5.1 (XL 4000) : Fig 4 decomposition_2x2, Fig 5 per_scenario_xl
  §5.2 (Random 1600) : Fig 6 additivity, Fig 7 lead_time_comparison
  §5.3.1 (distributions) : Fig 8 resilience_distribution
  §5.3.2 (cascade) : Fig 9 resilience_cascade, Fig 10 resilience_gradient
  §5.4 (paires) : Fig 11 paired_hazards_heatmap,
                  Fig 12 paired_hazards_recovery
  §5.5 (synthèse) : Fig 2 radar (référence)
  §6.2 (point de rupture) : Fig 13 resilience_breaking_point

Total : 13 figures, 3 tableaux principaux, ~16 tableaux secondaires.
DOCX passé de 51 KB → 1.2 MB.
</commit_message>
<xml_diff>
--- a/docs/paper_hal_v1.docx
+++ b/docs/paper_hal_v1.docx
@@ -944,7 +944,63 @@
     </w:p>
     <w:p>
       <w:r>
-        <w:t>La doctrine implémentée se décompose en 3 piliers techniques :</w:t>
+        <w:t>La doctrine implémentée se décompose en 3 piliers techniques</w:t>
+      </w:r>
+    </w:p>
+    <w:p>
+      <w:r>
+        <w:t>(Figure 1) :</w:t>
+      </w:r>
+    </w:p>
+    <w:p>
+      <w:pPr>
+        <w:jc w:val="center"/>
+      </w:pPr>
+      <w:r>
+        <w:drawing>
+          <wp:inline xmlns:a="http://schemas.openxmlformats.org/drawingml/2006/main" xmlns:pic="http://schemas.openxmlformats.org/drawingml/2006/picture">
+            <wp:extent cx="5486400" cy="3228266"/>
+            <wp:docPr id="1" name="Picture 1"/>
+            <wp:cNvGraphicFramePr>
+              <a:graphicFrameLocks noChangeAspect="1"/>
+            </wp:cNvGraphicFramePr>
+            <a:graphic>
+              <a:graphicData uri="http://schemas.openxmlformats.org/drawingml/2006/picture">
+                <pic:pic>
+                  <pic:nvPicPr>
+                    <pic:cNvPr id="0" name="paper_fig1_architecture.png"/>
+                    <pic:cNvPicPr/>
+                  </pic:nvPicPr>
+                  <pic:blipFill>
+                    <a:blip r:embed="rId9"/>
+                    <a:stretch>
+                      <a:fillRect/>
+                    </a:stretch>
+                  </pic:blipFill>
+                  <pic:spPr>
+                    <a:xfrm>
+                      <a:off x="0" y="0"/>
+                      <a:ext cx="5486400" cy="3228266"/>
+                    </a:xfrm>
+                    <a:prstGeom prst="rect"/>
+                  </pic:spPr>
+                </pic:pic>
+              </a:graphicData>
+            </a:graphic>
+          </wp:inline>
+        </w:drawing>
+      </w:r>
+    </w:p>
+    <w:p>
+      <w:pPr>
+        <w:jc w:val="center"/>
+      </w:pPr>
+      <w:r>
+        <w:rPr>
+          <w:i/>
+          <w:sz w:val="18"/>
+        </w:rPr>
+        <w:t>Figure 1 — Architecture doctrinale en 3 piliers</w:t>
       </w:r>
     </w:p>
     <w:tbl>
@@ -1746,7 +1802,7 @@
     </w:p>
     <w:p>
       <w:r>
-        <w:t>Cinq types d'aléas couvrent 5 domaines de perturbation :</w:t>
+        <w:t>Cinq types d'aléas couvrent 5 domaines de perturbation (Figure 3) :</w:t>
       </w:r>
     </w:p>
     <w:tbl>
@@ -1962,6 +2018,57 @@
         </w:tc>
       </w:tr>
     </w:tbl>
+    <w:p>
+      <w:pPr>
+        <w:jc w:val="center"/>
+      </w:pPr>
+      <w:r>
+        <w:drawing>
+          <wp:inline xmlns:a="http://schemas.openxmlformats.org/drawingml/2006/main" xmlns:pic="http://schemas.openxmlformats.org/drawingml/2006/picture">
+            <wp:extent cx="5486400" cy="2933172"/>
+            <wp:docPr id="2" name="Picture 2"/>
+            <wp:cNvGraphicFramePr>
+              <a:graphicFrameLocks noChangeAspect="1"/>
+            </wp:cNvGraphicFramePr>
+            <a:graphic>
+              <a:graphicData uri="http://schemas.openxmlformats.org/drawingml/2006/picture">
+                <pic:pic>
+                  <pic:nvPicPr>
+                    <pic:cNvPr id="0" name="paper_fig3_domain_mapping.png"/>
+                    <pic:cNvPicPr/>
+                  </pic:nvPicPr>
+                  <pic:blipFill>
+                    <a:blip r:embed="rId10"/>
+                    <a:stretch>
+                      <a:fillRect/>
+                    </a:stretch>
+                  </pic:blipFill>
+                  <pic:spPr>
+                    <a:xfrm>
+                      <a:off x="0" y="0"/>
+                      <a:ext cx="5486400" cy="2933172"/>
+                    </a:xfrm>
+                    <a:prstGeom prst="rect"/>
+                  </pic:spPr>
+                </pic:pic>
+              </a:graphicData>
+            </a:graphic>
+          </wp:inline>
+        </w:drawing>
+      </w:r>
+    </w:p>
+    <w:p>
+      <w:pPr>
+        <w:jc w:val="center"/>
+      </w:pPr>
+      <w:r>
+        <w:rPr>
+          <w:i/>
+          <w:sz w:val="18"/>
+        </w:rPr>
+        <w:t>Figure 3 — Mapping des 5 domaines de perturbation aux mécanismes du simulateur</w:t>
+      </w:r>
+    </w:p>
     <w:p>
       <w:pPr>
         <w:pStyle w:val="Heading3"/>
@@ -2532,6 +2639,108 @@
     </w:p>
     <w:p>
       <w:pPr>
+        <w:jc w:val="center"/>
+      </w:pPr>
+      <w:r>
+        <w:drawing>
+          <wp:inline xmlns:a="http://schemas.openxmlformats.org/drawingml/2006/main" xmlns:pic="http://schemas.openxmlformats.org/drawingml/2006/picture">
+            <wp:extent cx="5486400" cy="2312859"/>
+            <wp:docPr id="3" name="Picture 3"/>
+            <wp:cNvGraphicFramePr>
+              <a:graphicFrameLocks noChangeAspect="1"/>
+            </wp:cNvGraphicFramePr>
+            <a:graphic>
+              <a:graphicData uri="http://schemas.openxmlformats.org/drawingml/2006/picture">
+                <pic:pic>
+                  <pic:nvPicPr>
+                    <pic:cNvPr id="0" name="decomposition_2x2.png"/>
+                    <pic:cNvPicPr/>
+                  </pic:nvPicPr>
+                  <pic:blipFill>
+                    <a:blip r:embed="rId11"/>
+                    <a:stretch>
+                      <a:fillRect/>
+                    </a:stretch>
+                  </pic:blipFill>
+                  <pic:spPr>
+                    <a:xfrm>
+                      <a:off x="0" y="0"/>
+                      <a:ext cx="5486400" cy="2312859"/>
+                    </a:xfrm>
+                    <a:prstGeom prst="rect"/>
+                  </pic:spPr>
+                </pic:pic>
+              </a:graphicData>
+            </a:graphic>
+          </wp:inline>
+        </w:drawing>
+      </w:r>
+    </w:p>
+    <w:p>
+      <w:pPr>
+        <w:jc w:val="center"/>
+      </w:pPr>
+      <w:r>
+        <w:rPr>
+          <w:i/>
+          <w:sz w:val="18"/>
+        </w:rPr>
+        <w:t>Figure 4 — Décomposition 2×2 du coût (Δ vs OF) — étude XL + Random</w:t>
+      </w:r>
+    </w:p>
+    <w:p>
+      <w:pPr>
+        <w:jc w:val="center"/>
+      </w:pPr>
+      <w:r>
+        <w:drawing>
+          <wp:inline xmlns:a="http://schemas.openxmlformats.org/drawingml/2006/main" xmlns:pic="http://schemas.openxmlformats.org/drawingml/2006/picture">
+            <wp:extent cx="5486400" cy="2493496"/>
+            <wp:docPr id="4" name="Picture 4"/>
+            <wp:cNvGraphicFramePr>
+              <a:graphicFrameLocks noChangeAspect="1"/>
+            </wp:cNvGraphicFramePr>
+            <a:graphic>
+              <a:graphicData uri="http://schemas.openxmlformats.org/drawingml/2006/picture">
+                <pic:pic>
+                  <pic:nvPicPr>
+                    <pic:cNvPr id="0" name="per_scenario_xl.png"/>
+                    <pic:cNvPicPr/>
+                  </pic:nvPicPr>
+                  <pic:blipFill>
+                    <a:blip r:embed="rId12"/>
+                    <a:stretch>
+                      <a:fillRect/>
+                    </a:stretch>
+                  </pic:blipFill>
+                  <pic:spPr>
+                    <a:xfrm>
+                      <a:off x="0" y="0"/>
+                      <a:ext cx="5486400" cy="2493496"/>
+                    </a:xfrm>
+                    <a:prstGeom prst="rect"/>
+                  </pic:spPr>
+                </pic:pic>
+              </a:graphicData>
+            </a:graphic>
+          </wp:inline>
+        </w:drawing>
+      </w:r>
+    </w:p>
+    <w:p>
+      <w:pPr>
+        <w:jc w:val="center"/>
+      </w:pPr>
+      <w:r>
+        <w:rPr>
+          <w:i/>
+          <w:sz w:val="18"/>
+        </w:rPr>
+        <w:t>Figure 5 — Δ coût par scénario × doctrine — 4 000 runs XL</w:t>
+      </w:r>
+    </w:p>
+    <w:p>
+      <w:pPr>
         <w:pStyle w:val="Heading3"/>
       </w:pPr>
       <w:r>
@@ -2697,6 +2906,108 @@
     <w:p>
       <w:r>
         <w:t>un aléa qui aurait été détecté par l'event sourcing.</w:t>
+      </w:r>
+    </w:p>
+    <w:p>
+      <w:pPr>
+        <w:jc w:val="center"/>
+      </w:pPr>
+      <w:r>
+        <w:drawing>
+          <wp:inline xmlns:a="http://schemas.openxmlformats.org/drawingml/2006/main" xmlns:pic="http://schemas.openxmlformats.org/drawingml/2006/picture">
+            <wp:extent cx="5486400" cy="3414532"/>
+            <wp:docPr id="5" name="Picture 5"/>
+            <wp:cNvGraphicFramePr>
+              <a:graphicFrameLocks noChangeAspect="1"/>
+            </wp:cNvGraphicFramePr>
+            <a:graphic>
+              <a:graphicData uri="http://schemas.openxmlformats.org/drawingml/2006/picture">
+                <pic:pic>
+                  <pic:nvPicPr>
+                    <pic:cNvPr id="0" name="additivity.png"/>
+                    <pic:cNvPicPr/>
+                  </pic:nvPicPr>
+                  <pic:blipFill>
+                    <a:blip r:embed="rId13"/>
+                    <a:stretch>
+                      <a:fillRect/>
+                    </a:stretch>
+                  </pic:blipFill>
+                  <pic:spPr>
+                    <a:xfrm>
+                      <a:off x="0" y="0"/>
+                      <a:ext cx="5486400" cy="3414532"/>
+                    </a:xfrm>
+                    <a:prstGeom prst="rect"/>
+                  </pic:spPr>
+                </pic:pic>
+              </a:graphicData>
+            </a:graphic>
+          </wp:inline>
+        </w:drawing>
+      </w:r>
+    </w:p>
+    <w:p>
+      <w:pPr>
+        <w:jc w:val="center"/>
+      </w:pPr>
+      <w:r>
+        <w:rPr>
+          <w:i/>
+          <w:sz w:val="18"/>
+        </w:rPr>
+        <w:t>Figure 6 — Additivité quasi-parfaite des deux apports (1 600 runs Random)</w:t>
+      </w:r>
+    </w:p>
+    <w:p>
+      <w:pPr>
+        <w:jc w:val="center"/>
+      </w:pPr>
+      <w:r>
+        <w:drawing>
+          <wp:inline xmlns:a="http://schemas.openxmlformats.org/drawingml/2006/main" xmlns:pic="http://schemas.openxmlformats.org/drawingml/2006/picture">
+            <wp:extent cx="5486400" cy="2992582"/>
+            <wp:docPr id="6" name="Picture 6"/>
+            <wp:cNvGraphicFramePr>
+              <a:graphicFrameLocks noChangeAspect="1"/>
+            </wp:cNvGraphicFramePr>
+            <a:graphic>
+              <a:graphicData uri="http://schemas.openxmlformats.org/drawingml/2006/picture">
+                <pic:pic>
+                  <pic:nvPicPr>
+                    <pic:cNvPr id="0" name="lead_time_comparison.png"/>
+                    <pic:cNvPicPr/>
+                  </pic:nvPicPr>
+                  <pic:blipFill>
+                    <a:blip r:embed="rId14"/>
+                    <a:stretch>
+                      <a:fillRect/>
+                    </a:stretch>
+                  </pic:blipFill>
+                  <pic:spPr>
+                    <a:xfrm>
+                      <a:off x="0" y="0"/>
+                      <a:ext cx="5486400" cy="2992582"/>
+                    </a:xfrm>
+                    <a:prstGeom prst="rect"/>
+                  </pic:spPr>
+                </pic:pic>
+              </a:graphicData>
+            </a:graphic>
+          </wp:inline>
+        </w:drawing>
+      </w:r>
+    </w:p>
+    <w:p>
+      <w:pPr>
+        <w:jc w:val="center"/>
+      </w:pPr>
+      <w:r>
+        <w:rPr>
+          <w:i/>
+          <w:sz w:val="18"/>
+        </w:rPr>
+        <w:t>Figure 7 — Lead time par doctrine — convergence des 2 protocoles (XL et Random)</w:t>
       </w:r>
     </w:p>
     <w:p>
@@ -3012,6 +3323,57 @@
       </w:r>
     </w:p>
     <w:p>
+      <w:pPr>
+        <w:jc w:val="center"/>
+      </w:pPr>
+      <w:r>
+        <w:drawing>
+          <wp:inline xmlns:a="http://schemas.openxmlformats.org/drawingml/2006/main" xmlns:pic="http://schemas.openxmlformats.org/drawingml/2006/picture">
+            <wp:extent cx="5486400" cy="3276987"/>
+            <wp:docPr id="7" name="Picture 7"/>
+            <wp:cNvGraphicFramePr>
+              <a:graphicFrameLocks noChangeAspect="1"/>
+            </wp:cNvGraphicFramePr>
+            <a:graphic>
+              <a:graphicData uri="http://schemas.openxmlformats.org/drawingml/2006/picture">
+                <pic:pic>
+                  <pic:nvPicPr>
+                    <pic:cNvPr id="0" name="resilience_distribution.png"/>
+                    <pic:cNvPicPr/>
+                  </pic:nvPicPr>
+                  <pic:blipFill>
+                    <a:blip r:embed="rId15"/>
+                    <a:stretch>
+                      <a:fillRect/>
+                    </a:stretch>
+                  </pic:blipFill>
+                  <pic:spPr>
+                    <a:xfrm>
+                      <a:off x="0" y="0"/>
+                      <a:ext cx="5486400" cy="3276987"/>
+                    </a:xfrm>
+                    <a:prstGeom prst="rect"/>
+                  </pic:spPr>
+                </pic:pic>
+              </a:graphicData>
+            </a:graphic>
+          </wp:inline>
+        </w:drawing>
+      </w:r>
+    </w:p>
+    <w:p>
+      <w:pPr>
+        <w:jc w:val="center"/>
+      </w:pPr>
+      <w:r>
+        <w:rPr>
+          <w:i/>
+          <w:sz w:val="18"/>
+        </w:rPr>
+        <w:t>Figure 8 — Distribution du coût par doctrine — boîtes à moustaches P5/P95</w:t>
+      </w:r>
+    </w:p>
+    <w:p>
       <w:r>
         <w:t>5.3.2 Sensibilité aux cascades de pannes (300 runs)</w:t>
       </w:r>
@@ -3475,6 +3837,108 @@
     </w:p>
     <w:p>
       <w:pPr>
+        <w:jc w:val="center"/>
+      </w:pPr>
+      <w:r>
+        <w:drawing>
+          <wp:inline xmlns:a="http://schemas.openxmlformats.org/drawingml/2006/main" xmlns:pic="http://schemas.openxmlformats.org/drawingml/2006/picture">
+            <wp:extent cx="5486400" cy="2311367"/>
+            <wp:docPr id="8" name="Picture 8"/>
+            <wp:cNvGraphicFramePr>
+              <a:graphicFrameLocks noChangeAspect="1"/>
+            </wp:cNvGraphicFramePr>
+            <a:graphic>
+              <a:graphicData uri="http://schemas.openxmlformats.org/drawingml/2006/picture">
+                <pic:pic>
+                  <pic:nvPicPr>
+                    <pic:cNvPr id="0" name="resilience_cascade.png"/>
+                    <pic:cNvPicPr/>
+                  </pic:nvPicPr>
+                  <pic:blipFill>
+                    <a:blip r:embed="rId16"/>
+                    <a:stretch>
+                      <a:fillRect/>
+                    </a:stretch>
+                  </pic:blipFill>
+                  <pic:spPr>
+                    <a:xfrm>
+                      <a:off x="0" y="0"/>
+                      <a:ext cx="5486400" cy="2311367"/>
+                    </a:xfrm>
+                    <a:prstGeom prst="rect"/>
+                  </pic:spPr>
+                </pic:pic>
+              </a:graphicData>
+            </a:graphic>
+          </wp:inline>
+        </w:drawing>
+      </w:r>
+    </w:p>
+    <w:p>
+      <w:pPr>
+        <w:jc w:val="center"/>
+      </w:pPr>
+      <w:r>
+        <w:rPr>
+          <w:i/>
+          <w:sz w:val="18"/>
+        </w:rPr>
+        <w:t>Figure 9 — Coût et time-to-recover vs N pannes simultanées</w:t>
+      </w:r>
+    </w:p>
+    <w:p>
+      <w:pPr>
+        <w:jc w:val="center"/>
+      </w:pPr>
+      <w:r>
+        <w:drawing>
+          <wp:inline xmlns:a="http://schemas.openxmlformats.org/drawingml/2006/main" xmlns:pic="http://schemas.openxmlformats.org/drawingml/2006/picture">
+            <wp:extent cx="5486400" cy="2311367"/>
+            <wp:docPr id="9" name="Picture 9"/>
+            <wp:cNvGraphicFramePr>
+              <a:graphicFrameLocks noChangeAspect="1"/>
+            </wp:cNvGraphicFramePr>
+            <a:graphic>
+              <a:graphicData uri="http://schemas.openxmlformats.org/drawingml/2006/picture">
+                <pic:pic>
+                  <pic:nvPicPr>
+                    <pic:cNvPr id="0" name="resilience_gradient.png"/>
+                    <pic:cNvPicPr/>
+                  </pic:nvPicPr>
+                  <pic:blipFill>
+                    <a:blip r:embed="rId17"/>
+                    <a:stretch>
+                      <a:fillRect/>
+                    </a:stretch>
+                  </pic:blipFill>
+                  <pic:spPr>
+                    <a:xfrm>
+                      <a:off x="0" y="0"/>
+                      <a:ext cx="5486400" cy="2311367"/>
+                    </a:xfrm>
+                    <a:prstGeom prst="rect"/>
+                  </pic:spPr>
+                </pic:pic>
+              </a:graphicData>
+            </a:graphic>
+          </wp:inline>
+        </w:drawing>
+      </w:r>
+    </w:p>
+    <w:p>
+      <w:pPr>
+        <w:jc w:val="center"/>
+      </w:pPr>
+      <w:r>
+        <w:rPr>
+          <w:i/>
+          <w:sz w:val="18"/>
+        </w:rPr>
+        <w:t>Figure 10 — Gradient d'intensité d'aléa : coût moyen et P95 par doctrine</w:t>
+      </w:r>
+    </w:p>
+    <w:p>
+      <w:pPr>
         <w:pStyle w:val="Heading3"/>
       </w:pPr>
       <w:r>
@@ -3576,6 +4040,108 @@
     <w:p>
       <w:r>
         <w:t xml:space="preserve">  sur 24/25 cellules (la seule exception est Logi × Logi).</w:t>
+      </w:r>
+    </w:p>
+    <w:p>
+      <w:pPr>
+        <w:jc w:val="center"/>
+      </w:pPr>
+      <w:r>
+        <w:drawing>
+          <wp:inline xmlns:a="http://schemas.openxmlformats.org/drawingml/2006/main" xmlns:pic="http://schemas.openxmlformats.org/drawingml/2006/picture">
+            <wp:extent cx="5486400" cy="4772526"/>
+            <wp:docPr id="10" name="Picture 10"/>
+            <wp:cNvGraphicFramePr>
+              <a:graphicFrameLocks noChangeAspect="1"/>
+            </wp:cNvGraphicFramePr>
+            <a:graphic>
+              <a:graphicData uri="http://schemas.openxmlformats.org/drawingml/2006/picture">
+                <pic:pic>
+                  <pic:nvPicPr>
+                    <pic:cNvPr id="0" name="paired_hazards_heatmap.png"/>
+                    <pic:cNvPicPr/>
+                  </pic:nvPicPr>
+                  <pic:blipFill>
+                    <a:blip r:embed="rId18"/>
+                    <a:stretch>
+                      <a:fillRect/>
+                    </a:stretch>
+                  </pic:blipFill>
+                  <pic:spPr>
+                    <a:xfrm>
+                      <a:off x="0" y="0"/>
+                      <a:ext cx="5486400" cy="4772526"/>
+                    </a:xfrm>
+                    <a:prstGeom prst="rect"/>
+                  </pic:spPr>
+                </pic:pic>
+              </a:graphicData>
+            </a:graphic>
+          </wp:inline>
+        </w:drawing>
+      </w:r>
+    </w:p>
+    <w:p>
+      <w:pPr>
+        <w:jc w:val="center"/>
+      </w:pPr>
+      <w:r>
+        <w:rPr>
+          <w:i/>
+          <w:sz w:val="18"/>
+        </w:rPr>
+        <w:t>Figure 11 — Matrice 5×5 d'amplification de coût par doctrine</w:t>
+      </w:r>
+    </w:p>
+    <w:p>
+      <w:pPr>
+        <w:jc w:val="center"/>
+      </w:pPr>
+      <w:r>
+        <w:drawing>
+          <wp:inline xmlns:a="http://schemas.openxmlformats.org/drawingml/2006/main" xmlns:pic="http://schemas.openxmlformats.org/drawingml/2006/picture">
+            <wp:extent cx="5486400" cy="4670112"/>
+            <wp:docPr id="11" name="Picture 11"/>
+            <wp:cNvGraphicFramePr>
+              <a:graphicFrameLocks noChangeAspect="1"/>
+            </wp:cNvGraphicFramePr>
+            <a:graphic>
+              <a:graphicData uri="http://schemas.openxmlformats.org/drawingml/2006/picture">
+                <pic:pic>
+                  <pic:nvPicPr>
+                    <pic:cNvPr id="0" name="paired_hazards_recovery.png"/>
+                    <pic:cNvPicPr/>
+                  </pic:nvPicPr>
+                  <pic:blipFill>
+                    <a:blip r:embed="rId19"/>
+                    <a:stretch>
+                      <a:fillRect/>
+                    </a:stretch>
+                  </pic:blipFill>
+                  <pic:spPr>
+                    <a:xfrm>
+                      <a:off x="0" y="0"/>
+                      <a:ext cx="5486400" cy="4670112"/>
+                    </a:xfrm>
+                    <a:prstGeom prst="rect"/>
+                  </pic:spPr>
+                </pic:pic>
+              </a:graphicData>
+            </a:graphic>
+          </wp:inline>
+        </w:drawing>
+      </w:r>
+    </w:p>
+    <w:p>
+      <w:pPr>
+        <w:jc w:val="center"/>
+      </w:pPr>
+      <w:r>
+        <w:rPr>
+          <w:i/>
+          <w:sz w:val="18"/>
+        </w:rPr>
+        <w:t>Figure 12 — Time-to-recover par paire de domaines, par doctrine</w:t>
       </w:r>
     </w:p>
     <w:p>
@@ -3932,6 +4498,57 @@
         </w:tc>
       </w:tr>
     </w:tbl>
+    <w:p>
+      <w:pPr>
+        <w:jc w:val="center"/>
+      </w:pPr>
+      <w:r>
+        <w:drawing>
+          <wp:inline xmlns:a="http://schemas.openxmlformats.org/drawingml/2006/main" xmlns:pic="http://schemas.openxmlformats.org/drawingml/2006/picture">
+            <wp:extent cx="5486400" cy="4736706"/>
+            <wp:docPr id="12" name="Picture 12"/>
+            <wp:cNvGraphicFramePr>
+              <a:graphicFrameLocks noChangeAspect="1"/>
+            </wp:cNvGraphicFramePr>
+            <a:graphic>
+              <a:graphicData uri="http://schemas.openxmlformats.org/drawingml/2006/picture">
+                <pic:pic>
+                  <pic:nvPicPr>
+                    <pic:cNvPr id="0" name="paper_fig2_radar_synthesis.png"/>
+                    <pic:cNvPicPr/>
+                  </pic:nvPicPr>
+                  <pic:blipFill>
+                    <a:blip r:embed="rId20"/>
+                    <a:stretch>
+                      <a:fillRect/>
+                    </a:stretch>
+                  </pic:blipFill>
+                  <pic:spPr>
+                    <a:xfrm>
+                      <a:off x="0" y="0"/>
+                      <a:ext cx="5486400" cy="4736706"/>
+                    </a:xfrm>
+                    <a:prstGeom prst="rect"/>
+                  </pic:spPr>
+                </pic:pic>
+              </a:graphicData>
+            </a:graphic>
+          </wp:inline>
+        </w:drawing>
+      </w:r>
+    </w:p>
+    <w:p>
+      <w:pPr>
+        <w:jc w:val="center"/>
+      </w:pPr>
+      <w:r>
+        <w:rPr>
+          <w:i/>
+          <w:sz w:val="18"/>
+        </w:rPr>
+        <w:t>Figure 2 — Synthèse exécutive : 5 dimensions × 4 doctrines (radar)</w:t>
+      </w:r>
+    </w:p>
     <w:p/>
     <w:p>
       <w:pPr>
@@ -4150,6 +4767,57 @@
     <w:p>
       <w:r>
         <w:t>nécessaire pour mesurer un effondrement réel de disponibilité.</w:t>
+      </w:r>
+    </w:p>
+    <w:p>
+      <w:pPr>
+        <w:jc w:val="center"/>
+      </w:pPr>
+      <w:r>
+        <w:drawing>
+          <wp:inline xmlns:a="http://schemas.openxmlformats.org/drawingml/2006/main" xmlns:pic="http://schemas.openxmlformats.org/drawingml/2006/picture">
+            <wp:extent cx="5486400" cy="2145281"/>
+            <wp:docPr id="13" name="Picture 13"/>
+            <wp:cNvGraphicFramePr>
+              <a:graphicFrameLocks noChangeAspect="1"/>
+            </wp:cNvGraphicFramePr>
+            <a:graphic>
+              <a:graphicData uri="http://schemas.openxmlformats.org/drawingml/2006/picture">
+                <pic:pic>
+                  <pic:nvPicPr>
+                    <pic:cNvPr id="0" name="resilience_breaking_point.png"/>
+                    <pic:cNvPicPr/>
+                  </pic:nvPicPr>
+                  <pic:blipFill>
+                    <a:blip r:embed="rId21"/>
+                    <a:stretch>
+                      <a:fillRect/>
+                    </a:stretch>
+                  </pic:blipFill>
+                  <pic:spPr>
+                    <a:xfrm>
+                      <a:off x="0" y="0"/>
+                      <a:ext cx="5486400" cy="2145281"/>
+                    </a:xfrm>
+                    <a:prstGeom prst="rect"/>
+                  </pic:spPr>
+                </pic:pic>
+              </a:graphicData>
+            </a:graphic>
+          </wp:inline>
+        </w:drawing>
+      </w:r>
+    </w:p>
+    <w:p>
+      <w:pPr>
+        <w:jc w:val="center"/>
+      </w:pPr>
+      <w:r>
+        <w:rPr>
+          <w:i/>
+          <w:sz w:val="18"/>
+        </w:rPr>
+        <w:t>Figure 13 — Point de rupture : coût et disponibilité vs N pannes simultanées étendues (6-15)</w:t>
       </w:r>
     </w:p>
     <w:p/>

</xml_diff>